<commit_message>
Separate title block lines so they render as distinct paragraphs
</commit_message>
<xml_diff>
--- a/docs/Project1-Proposal-Anderson.docx
+++ b/docs/Project1-Proposal-Anderson.docx
@@ -40,7 +40,43 @@
           <w:b w:val="0"/>
           <w:i w:val="0"/>
         </w:rPr>
-        <w:t>CMST 387 Web Design Resource Hub Gilbert Anderson CMST 387 6300: Principles of Web Design and Technology III University of Maryland Global Campus Deployment target: https://cmst387-umgc-ganderson58.azurewebsites.net</w:t>
+        <w:t>CMST 387 Web Design Resource Hub</w:t>
+      </w:r>
+    </w:p>
+    <w:p>
+      <w:r>
+        <w:rPr>
+          <w:b w:val="0"/>
+          <w:i w:val="0"/>
+        </w:rPr>
+        <w:t>Gilbert Anderson</w:t>
+      </w:r>
+    </w:p>
+    <w:p>
+      <w:r>
+        <w:rPr>
+          <w:b w:val="0"/>
+          <w:i w:val="0"/>
+        </w:rPr>
+        <w:t>CMST 387 6300: Principles of Web Design and Technology III</w:t>
+      </w:r>
+    </w:p>
+    <w:p>
+      <w:r>
+        <w:rPr>
+          <w:b w:val="0"/>
+          <w:i w:val="0"/>
+        </w:rPr>
+        <w:t>University of Maryland Global Campus</w:t>
+      </w:r>
+    </w:p>
+    <w:p>
+      <w:r>
+        <w:rPr>
+          <w:b w:val="0"/>
+          <w:i w:val="0"/>
+        </w:rPr>
+        <w:t>Deployment target: https://cmst387-umgc-ganderson58.azurewebsites.net</w:t>
       </w:r>
     </w:p>
     <w:p>

</xml_diff>

<commit_message>
Rename course from CMST 387 to WDDE 385 across all content
</commit_message>
<xml_diff>
--- a/docs/Project1-Proposal-Anderson.docx
+++ b/docs/Project1-Proposal-Anderson.docx
@@ -19,7 +19,7 @@
         <w:t xml:space="preserve">Course: </w:t>
       </w:r>
       <w:r>
-        <w:t>CMST 387 6300 - Principles of Web Design and Technology III</w:t>
+        <w:t>WDDE 385 - Principles of Web Design and Technology III</w:t>
       </w:r>
     </w:p>
     <w:p>
@@ -40,7 +40,7 @@
           <w:b w:val="0"/>
           <w:i w:val="0"/>
         </w:rPr>
-        <w:t>CMST 387 Web Design Resource Hub</w:t>
+        <w:t>WDDE 385 Web Design Resource Hub</w:t>
       </w:r>
     </w:p>
     <w:p>
@@ -58,7 +58,7 @@
           <w:b w:val="0"/>
           <w:i w:val="0"/>
         </w:rPr>
-        <w:t>CMST 387 6300: Principles of Web Design and Technology III</w:t>
+        <w:t>WDDE 385: Principles of Web Design and Technology III</w:t>
       </w:r>
     </w:p>
     <w:p>

</xml_diff>